<commit_message>
fix(galascope-epc): apply pre-send corrections
- Advance payment trigger: 7 days → 30 days (§1A.3 + §7.1)
  Needed: bank requires signed EPC before approving Dino's facility
- Connection Terms longstop: [●] months → 12 months (§1A.1)
- Client signature block: Name pre-filled as 'Ntinos Konstantinos', Title: Director
  (Galascope Ltd director; Greek: ΝΤΙΝΟΣ ΚΩΝΣΤΑΝΤΙΝΟΣ)
- Registration confirmed: HE 303759, Karaiskaki 6, City House, 3032 Limassol

Co-authored-by: Cursor <cursoragent@cursor.com>
</commit_message>
<xml_diff>
--- a/docs/clients/group-order/Group2_Esperia_Energy/contracts/EPC-Galascope-Esperia-batch1-may2026.docx
+++ b/docs/clients/group-order/Group2_Esperia_Energy/contracts/EPC-Galascope-Esperia-batch1-may2026.docx
@@ -229,7 +229,7 @@
           <w:b w:val="0"/>
           <w:sz w:val="20"/>
         </w:rPr>
-        <w:t>1A.1 This Agreement is conditional upon the Client obtaining grid connection terms from EAC/DSO for the Site (“Connection Terms”) within [●] months of the Effective Date (“Long-Stop Date”).</w:t>
+        <w:t>1A.1 This Agreement is conditional upon the Client obtaining grid connection terms from EAC/DSO for the Site (“Connection Terms”) within twelve (12) months of the Effective Date (“Long-Stop Date”).</w:t>
       </w:r>
     </w:p>
     <w:p>
@@ -247,7 +247,7 @@
           <w:b w:val="0"/>
           <w:sz w:val="20"/>
         </w:rPr>
-        <w:t>1A.3 The advance payment under Section 7.1(a) shall become due within seven (7) days of the later of: (i) the Effective Date; and (ii) receipt of Connection Terms.</w:t>
+        <w:t>1A.3 The advance payment under Section 7.1(a) shall become due within thirty (30) days of the later of: (i) the Effective Date; and (ii) receipt of Connection Terms.</w:t>
       </w:r>
     </w:p>
     <w:p>
@@ -1578,7 +1578,7 @@
           <w:b w:val="0"/>
           <w:sz w:val="20"/>
         </w:rPr>
-        <w:t>(a) 30% advance payment within seven (7) days of the payment trigger under Section 1A.3;</w:t>
+        <w:t>(a) 30% advance payment within thirty (30) days of the payment trigger under Section 1A.3;</w:t>
       </w:r>
     </w:p>
     <w:p>
@@ -3926,7 +3926,7 @@
     </w:p>
     <w:p>
       <w:r>
-        <w:t xml:space="preserve">  Advance  (30%):  EUR 1,039,560.00  - Within 7 days of signing</w:t>
+        <w:t xml:space="preserve">  Advance  (30%):  EUR 1,039,560.00  - Within 30 days of signing</w:t>
       </w:r>
     </w:p>
     <w:p>
@@ -4454,7 +4454,7 @@
           <w:b w:val="0"/>
           <w:sz w:val="20"/>
         </w:rPr>
-        <w:t>Name: __________________________</w:t>
+        <w:t>Name:   Ntinos Konstantinos</w:t>
       </w:r>
     </w:p>
     <w:p>
@@ -4463,7 +4463,7 @@
           <w:b w:val="0"/>
           <w:sz w:val="20"/>
         </w:rPr>
-        <w:t>Title: __________________________</w:t>
+        <w:t>Title:   Director</w:t>
       </w:r>
     </w:p>
     <w:p>

</xml_diff>